<commit_message>
R13: Martin et al. (2026) as preprint
Co-Authored-By: Claude Opus 5.5 <noreply@anthropic.com>
Claude-Session: https://claude.ai/code/session_01Q96WePso3R7jviE8KBARip
</commit_message>
<xml_diff>
--- a/drafts/Manuscript_R13_APA.docx
+++ b/drafts/Manuscript_R13_APA.docx
@@ -6072,13 +6072,13 @@
         <w:t>Zero-change construals as a probe into event structure: Mandarin Chinese simple verbs and their anticausative vs. antiagentive alternants</w:t>
       </w:r>
       <w:r>
-        <w:t xml:space="preserve"> [Manuscript]. ResearchGate. </w:t>
+        <w:t xml:space="preserve"> [Preprint]. ResearchGate. </w:t>
       </w:r>
       <w:r>
         <w:rPr>
           <w:highlight w:val="yellow"/>
         </w:rPr>
-        <w:t>⟦待核：发表状态与链接⟧</w:t>
+        <w:t>⟦待补：ResearchGate 链接或 DOI⟧</w:t>
       </w:r>
     </w:p>
     <w:p>

</xml_diff>

<commit_message>
R13: distinguish RVC conventionality (expression) from action-result association (event); revise rationale for corpus check
Co-Authored-By: Claude Opus 5.5 <noreply@anthropic.com>
Claude-Session: https://claude.ai/code/session_01Q96WePso3R7jviE8KBARip
</commit_message>
<xml_diff>
--- a/drafts/Manuscript_R13_APA.docx
+++ b/drafts/Manuscript_R13_APA.docx
@@ -707,15 +707,32 @@
       </w:r>
       <w:proofErr w:type="spellEnd"/>
       <w:r>
-        <w:t xml:space="preserve"> “beat.” These combinations are not equally conventional, however, and existing accounts do not specify what makes the action named by a given V1 a </w:t>
+        <w:t xml:space="preserve"> “beat.”</w:t>
       </w:r>
       <w:proofErr w:type="gramStart"/>
-      <w:r>
-        <w:t>more or less natural</w:t>
-      </w:r>
+      <w:r/>
       <w:proofErr w:type="gramEnd"/>
-      <w:r>
-        <w:t xml:space="preserve"> means of bringing about a given result. The next section addresses this relation.</w:t>
+      <w:r/>
+      <w:r>
+        <w:t xml:space="preserve"> These combinations are not equally conventional, however: </w:t>
+      </w:r>
+      <w:r>
+        <w:rPr>
+          <w:i/>
+        </w:rPr>
+        <w:t>chuī-miè</w:t>
+      </w:r>
+      <w:r>
+        <w:t xml:space="preserve"> “blow-extinguished” is an established expression, whereas </w:t>
+      </w:r>
+      <w:r>
+        <w:rPr>
+          <w:i/>
+        </w:rPr>
+        <w:t>huī-miè</w:t>
+      </w:r>
+      <w:r>
+        <w:t xml:space="preserve"> “wave-extinguished” is hardly used. Conventionality is a property of the compound as an expression. It is related to, but distinct from, how natural the action named by V1 is as a means of bringing about the result named by V2, which is a property of the event. Existing accounts do not specify what makes a given action a more or less natural means of bringing about a given result. The next section addresses this relation.</w:t>
       </w:r>
     </w:p>
     <w:p>
@@ -870,8 +887,7 @@
         <w:t xml:space="preserve">, how typical the action is as a means of achieving that result. The two ratings approach the relation from the action and from the result, respectively: Blowing on a candle, for example, is both likely to put it </w:t>
       </w:r>
       <w:r>
-        <w:lastRenderedPageBreak/>
-        <w:t>out and a typical way of doing so, whereas waving at it is neither. They are used jointly to verify and characterize the contrast between the paired V1s (see Materials), and the study does not attempt to separate their contributions. Neither rating measures lexical entailment or children’s own knowledge; both are adult reference measures of the relations between the selected actions and their target results.</w:t>
+        <w:t>out and a typical way of doing so, whereas waving at it is neither. Both ratings concern the relation between an action and a result in the event, not how conventional the corresponding RVC is. They are used jointly to verify and characterize the contrast between the paired V1s (see Materials), and the study does not attempt to separate their contributions. Neither rating measures lexical entailment or children’s own knowledge; both are adult reference measures of the relations between the selected actions and their target results.</w:t>
       </w:r>
     </w:p>
     <w:p>
@@ -4638,7 +4654,7 @@
     </w:p>
     <w:p>
       <w:r>
-        <w:t xml:space="preserve">We also examined how conventional each RVC is, for two reasons. First, as noted in the Introduction, V1–V2 combinations differ in how conventional they are, and an action that reliably brings about a result is likely to be described often with the corresponding RVC; corpus frequency thus characterizes the pairs independently of the adult ratings. Second, children may be more familiar with the RVCs formed with stronger-association V1s, and familiarity with an RVC could itself affect how they interpret the corresponding V1 (see General Discussion). We therefore searched the modern Chinese section of the CCL corpus (Zhan et al., 2019) for each of the 20 RVCs. The corpus reports the number of documents in which a string occurs rather than the number of tokens, and string matching also returns sequences in which the two characters belong to different words (e.g., </w:t>
+        <w:t xml:space="preserve">We also examined how conventional each RVC is. Conventionality concerns the RVC as an expression rather than the relation between the action and the result, but the two are likely to go together, because an action that reliably brings about a result is likely to be described often with the corresponding RVC. If the RVCs formed with stronger-association V1s are also more conventional, children may be more familiar with them, and familiarity with an RVC could itself affect how they interpret the corresponding V1 (see General Discussion). We therefore searched the modern Chinese section of the CCL corpus (Zhan et al., 2019) for each of the 20 RVCs. The corpus reports the number of documents in which a string occurs rather than the number of tokens, and string matching also returns sequences in which the two characters belong to different words (e.g., </w:t>
       </w:r>
       <w:r>
         <w:rPr>

</xml_diff>

<commit_message>
R13: simpler definition of conventionality; corpus check motivated by V1-V2 combination
Co-Authored-By: Claude Opus 5.5 <noreply@anthropic.com>
Claude-Session: https://claude.ai/code/session_01Q96WePso3R7jviE8KBARip
</commit_message>
<xml_diff>
--- a/drafts/Manuscript_R13_APA.docx
+++ b/drafts/Manuscript_R13_APA.docx
@@ -714,7 +714,16 @@
       <w:proofErr w:type="gramEnd"/>
       <w:r/>
       <w:r>
-        <w:t xml:space="preserve"> These combinations are not equally conventional, however: </w:t>
+        <w:t xml:space="preserve"> These combinations are not equally conventional, however. By </w:t>
+      </w:r>
+      <w:r>
+        <w:rPr>
+          <w:i/>
+        </w:rPr>
+        <w:t>conventional</w:t>
+      </w:r>
+      <w:r>
+        <w:t xml:space="preserve"> we mean how established an RVC is as an expression, that is, how commonly speakers use it: </w:t>
       </w:r>
       <w:r>
         <w:rPr>
@@ -723,7 +732,7 @@
         <w:t>chuī-miè</w:t>
       </w:r>
       <w:r>
-        <w:t xml:space="preserve"> “blow-extinguished” is an established expression, whereas </w:t>
+        <w:t xml:space="preserve"> “blow-extinguished” is a common expression, whereas </w:t>
       </w:r>
       <w:r>
         <w:rPr>
@@ -732,7 +741,7 @@
         <w:t>huī-miè</w:t>
       </w:r>
       <w:r>
-        <w:t xml:space="preserve"> “wave-extinguished” is hardly used. Conventionality is a property of the compound as an expression. It is related to, but distinct from, how natural the action named by V1 is as a means of bringing about the result named by V2, which is a property of the event. Existing accounts do not specify what makes a given action a more or less natural means of bringing about a given result. The next section addresses this relation.</w:t>
+        <w:t xml:space="preserve"> “wave-extinguished” is hardly ever used. This is different from how natural the action is as a means of bringing about the result: The former concerns the expression, the latter the event. Existing accounts do not specify what makes a given action a more or less natural means of bringing about a given result. The next section addresses this relation.</w:t>
       </w:r>
     </w:p>
     <w:p>
@@ -4654,7 +4663,7 @@
     </w:p>
     <w:p>
       <w:r>
-        <w:t xml:space="preserve">We also examined how conventional each RVC is. Conventionality concerns the RVC as an expression rather than the relation between the action and the result, but the two are likely to go together, because an action that reliably brings about a result is likely to be described often with the corresponding RVC. If the RVCs formed with stronger-association V1s are also more conventional, children may be more familiar with them, and familiarity with an RVC could itself affect how they interpret the corresponding V1 (see General Discussion). We therefore searched the modern Chinese section of the CCL corpus (Zhan et al., 2019) for each of the 20 RVCs. The corpus reports the number of documents in which a string occurs rather than the number of tokens, and string matching also returns sequences in which the two characters belong to different words (e.g., </w:t>
+        <w:t xml:space="preserve">We also examined how conventional each RVC is. As noted in the Introduction, whether a V1 and a V2 combine depends on how the action named by V1 relates to the result named by V2. If the two actions in a pair differ in their association with the target result, this difference should also be reflected in the language, such that the RVC formed with the stronger-association V1 is the more conventional one. Corpus frequency thus provides a check on the contrast between the paired V1s that does not rely on the adult ratings, although conventionality concerns the RVC as an expression rather than the action–result relation itself. We therefore searched the modern Chinese section of the CCL corpus (Zhan et al., 2019) for each of the 20 RVCs. The corpus reports the number of documents in which a string occurs rather than the number of tokens, and string matching also returns sequences in which the two characters belong to different words (e.g., </w:t>
       </w:r>
       <w:r>
         <w:rPr>

</xml_diff>